<commit_message>
Add final repository link to submission materials
</commit_message>
<xml_diff>
--- a/deliverables/22097191_ZHANG_YUE_P2_Research_Project.docx
+++ b/deliverables/22097191_ZHANG_YUE_P2_Research_Project.docx
@@ -3616,6 +3616,41 @@
     </w:p>
     <w:p>
       <w:pPr>
+        <w:ind w:firstLine="360"/>
+      </w:pPr>
+      <w:r>
+        <w:rPr>
+          <w:b/>
+        </w:rPr>
+        <w:t>Repository:</w:t>
+      </w:r>
+      <w:r>
+        <w:t xml:space="preserve"> https://github.com/yzy542968-jpg/wqf7023-medical-rag</w:t>
+      </w:r>
+    </w:p>
+    <w:p>
+      <w:pPr>
+        <w:ind w:firstLine="360"/>
+      </w:pPr>
+      <w:r>
+        <w:rPr>
+          <w:b/>
+        </w:rPr>
+        <w:t>Submission release:</w:t>
+      </w:r>
+      <w:r>
+        <w:t xml:space="preserve"> </w:t>
+      </w:r>
+      <w:r>
+        <w:rPr>
+          <w:rFonts w:ascii="Consolas" w:hAnsi="Consolas" w:eastAsia="Consolas" w:cs="Consolas"/>
+          <w:sz w:val="19"/>
+        </w:rPr>
+        <w:t>p2-submission</w:t>
+      </w:r>
+    </w:p>
+    <w:p>
+      <w:pPr>
         <w:spacing w:before="80" w:after="160" w:line="240" w:lineRule="auto"/>
         <w:ind w:left="259" w:right="259"/>
         <w:jc w:val="left"/>

</xml_diff>